<commit_message>
Zamień długie myślniki na zwykłe w dokumentacji
Co-Authored-By: Claude Opus 5.5 <noreply@anthropic.com>
Claude-Session: https://claude.ai/code/session_013ZAHXaNmfgzQq3snLwVkTj
</commit_message>
<xml_diff>
--- a/docs/pakiety/Pakiet_STUDENT_Lekcja_2_Szymankiewicz_34562.docx
+++ b/docs/pakiety/Pakiet_STUDENT_Lekcja_2_Szymankiewicz_34562.docx
@@ -640,7 +640,7 @@
                 <w:sz w:val="17"/>
                 <w:szCs w:val="17"/>
               </w:rPr>
-              <w:t xml:space="preserve">BR – nagłówek „ODBIORCA”; §1 Kontekst biznesowy</w:t>
+              <w:t xml:space="preserve">BR - nagłówek „ODBIORCA”; §1 Kontekst biznesowy</w:t>
             </w:r>
           </w:p>
         </w:tc>
@@ -707,7 +707,7 @@
                 <w:sz w:val="17"/>
                 <w:szCs w:val="17"/>
               </w:rPr>
-              <w:t xml:space="preserve">Krótkie odprawy (np. poranna – raport z poprzedniego dnia) oraz przygotowanie podsumowań dziennych, tygodniowych, miesięcznych i dla okresów kampanii dla osób od sprzedaży i realizacji.</w:t>
+              <w:t xml:space="preserve">Krótkie odprawy (np. poranna - raport z poprzedniego dnia) oraz przygotowanie podsumowań dziennych, tygodniowych, miesięcznych i dla okresów kampanii dla osób od sprzedaży i realizacji.</w:t>
             </w:r>
           </w:p>
         </w:tc>
@@ -803,7 +803,7 @@
                 <w:sz w:val="17"/>
                 <w:szCs w:val="17"/>
               </w:rPr>
-              <w:t xml:space="preserve">Ocena skali i wartości sprzedaży w okresie oraz stanu realizacji zamówień (struktura statusów) – np. czy kampania przyniosła sprzedaż i czy zamówienia nie utknęły w realizacji.</w:t>
+              <w:t xml:space="preserve">Ocena skali i wartości sprzedaży w okresie oraz stanu realizacji zamówień (struktura statusów) - np. czy kampania przyniosła sprzedaż i czy zamówienia nie utknęły w realizacji.</w:t>
             </w:r>
           </w:p>
         </w:tc>
@@ -1201,7 +1201,7 @@
                 <w:sz w:val="17"/>
                 <w:szCs w:val="17"/>
               </w:rPr>
-              <w:t xml:space="preserve">System liczy raport ze wszystkich zamówień – nie da się wskazać okresu.</w:t>
+              <w:t xml:space="preserve">System liczy raport ze wszystkich zamówień - nie da się wskazać okresu.</w:t>
             </w:r>
           </w:p>
         </w:tc>
@@ -3656,7 +3656,7 @@
                 <w:sz w:val="17"/>
                 <w:szCs w:val="17"/>
               </w:rPr>
-              <w:t xml:space="preserve">Zakres zmiany – historia statusów oznaczałaby przebudowę modelu danych (poza zakresem wg §15)</w:t>
+              <w:t xml:space="preserve">Zakres zmiany - historia statusów oznaczałaby przebudowę modelu danych (poza zakresem wg §15)</w:t>
             </w:r>
           </w:p>
         </w:tc>
@@ -4036,7 +4036,7 @@
                 <w:sz w:val="17"/>
                 <w:szCs w:val="17"/>
               </w:rPr>
-              <w:t xml:space="preserve">Reguły walidacji – granica między ochroną przed błędem a blokowaniem analiz historycznych (§6)</w:t>
+              <w:t xml:space="preserve">Reguły walidacji - granica między ochroną przed błędem a blokowaniem analiz historycznych (§6)</w:t>
             </w:r>
           </w:p>
         </w:tc>
@@ -4684,7 +4684,7 @@
                 <w:sz w:val="17"/>
                 <w:szCs w:val="17"/>
               </w:rPr>
-              <w:t xml:space="preserve">Zmienia sposób liczenia głównej wartości – bez odpowiedzi nie da się napisać AC dla podsumowania.</w:t>
+              <w:t xml:space="preserve">Zmienia sposób liczenia głównej wartości - bez odpowiedzi nie da się napisać AC dla podsumowania.</w:t>
             </w:r>
           </w:p>
         </w:tc>
@@ -5217,7 +5217,7 @@
           <w:sz w:val="20"/>
           <w:szCs w:val="20"/>
         </w:rPr>
-        <w:t xml:space="preserve">Pytanie 4 (status bieżący czy z końca okresu): jeśli PO oczekuje statusów historycznych, trzeba by przechowywać historię zmian statusów, czyli przebudować model danych – coś, co BR w §15 wyłącza z zakresu.</w:t>
+        <w:t xml:space="preserve">Pytanie 4 (status bieżący czy z końca okresu): jeśli PO oczekuje statusów historycznych, trzeba by przechowywać historię zmian statusów, czyli przebudować model danych - coś, co BR w §15 wyłącza z zakresu.</w:t>
       </w:r>
     </w:p>
     <w:p>
@@ -5243,7 +5243,7 @@
           <w:sz w:val="20"/>
           <w:szCs w:val="20"/>
         </w:rPr>
-        <w:t xml:space="preserve">Że data końcowa jest włącznie do końca dnia – brzmi oczywiście, ale BR mówi tylko o „zwykłym rozumieniu zakresu dat”, a created_at zawiera godzinę, więc to wymaga potwierdzenia.</w:t>
+        <w:t xml:space="preserve">Że data końcowa jest włącznie do końca dnia - brzmi oczywiście, ale BR mówi tylko o „zwykłym rozumieniu zakresu dat”, a created_at zawiera godzinę, więc to wymaga potwierdzenia.</w:t>
       </w:r>
     </w:p>
     <w:p>
@@ -5284,7 +5284,7 @@
           <w:sz w:val="20"/>
           <w:szCs w:val="20"/>
         </w:rPr>
-        <w:t xml:space="preserve">Nie dotyczy – praca indywidualna (zespół jednoosobowy).</w:t>
+        <w:t xml:space="preserve">Nie dotyczy - praca indywidualna (zespół jednoosobowy).</w:t>
       </w:r>
     </w:p>
     <w:p>
@@ -5310,7 +5310,7 @@
           <w:sz w:val="20"/>
           <w:szCs w:val="20"/>
         </w:rPr>
-        <w:t xml:space="preserve">Nie dotyczy – praca indywidualna (zespół jednoosobowy).</w:t>
+        <w:t xml:space="preserve">Nie dotyczy - praca indywidualna (zespół jednoosobowy).</w:t>
       </w:r>
     </w:p>
     <w:p>
@@ -5351,7 +5351,7 @@
           <w:sz w:val="20"/>
           <w:szCs w:val="20"/>
         </w:rPr>
-        <w:t xml:space="preserve">Nie dotyczy – praca indywidualna (zespół jednoosobowy).</w:t>
+        <w:t xml:space="preserve">Nie dotyczy - praca indywidualna (zespół jednoosobowy).</w:t>
       </w:r>
     </w:p>
     <w:p>
@@ -5377,7 +5377,7 @@
           <w:sz w:val="20"/>
           <w:szCs w:val="20"/>
         </w:rPr>
-        <w:t xml:space="preserve">Nie dotyczy – praca indywidualna (zespół jednoosobowy).</w:t>
+        <w:t xml:space="preserve">Nie dotyczy - praca indywidualna (zespół jednoosobowy).</w:t>
       </w:r>
     </w:p>
     <w:sectPr>

</xml_diff>

<commit_message>
Uzupełnij rejestr decyzji po refinemencie i ujednolić znaki
Rola PO odegrana w pracy indywidualnej, potwierdzenie PO, decyzja dla NEW,
zwykłe znaki zamiast strzałek i cudzysłowów drukarskich.

Co-Authored-By: Claude Opus 5.5 <noreply@anthropic.com>
Claude-Session: https://claude.ai/code/session_013ZAHXaNmfgzQq3snLwVkTj
</commit_message>
<xml_diff>
--- a/docs/pakiety/Pakiet_STUDENT_Lekcja_2_Szymankiewicz_34562.docx
+++ b/docs/pakiety/Pakiet_STUDENT_Lekcja_2_Szymankiewicz_34562.docx
@@ -39,7 +39,7 @@
           <w:sz w:val="20"/>
           <w:szCs w:val="20"/>
         </w:rPr>
-        <w:t xml:space="preserve">Student: Łukasz Szymankiewicz · nr albumu 34562</w:t>
+        <w:t xml:space="preserve">Student: Łukasz Szymankiewicz, nr albumu 34562</w:t>
       </w:r>
     </w:p>
     <w:p>
@@ -52,7 +52,7 @@
           <w:sz w:val="20"/>
           <w:szCs w:val="20"/>
         </w:rPr>
-        <w:t xml:space="preserve">Grupa: INF 3-4 26_27Z · Data: 25.10.2026</w:t>
+        <w:t xml:space="preserve">Grupa: INF 3-4 26_27Z, data: 25.10.2026</w:t>
       </w:r>
     </w:p>
     <w:p>
@@ -65,7 +65,7 @@
           <w:sz w:val="20"/>
           <w:szCs w:val="20"/>
         </w:rPr>
-        <w:t xml:space="preserve">Repozytorium: github.com/cewa-stack/orderflow · gałąź feature/order-reporting</w:t>
+        <w:t xml:space="preserve">Repozytorium: github.com/cewa-stack/orderflow, gałąź feature/order-reporting</w:t>
       </w:r>
     </w:p>
     <w:p>
@@ -640,7 +640,7 @@
                 <w:sz w:val="17"/>
                 <w:szCs w:val="17"/>
               </w:rPr>
-              <w:t xml:space="preserve">BR - nagłówek „ODBIORCA”; §1 Kontekst biznesowy</w:t>
+              <w:t xml:space="preserve">BR - nagłówek "ODBIORCA"; pkt 1 Kontekst biznesowy</w:t>
             </w:r>
           </w:p>
         </w:tc>
@@ -738,7 +738,7 @@
                 <w:sz w:val="17"/>
                 <w:szCs w:val="17"/>
               </w:rPr>
-              <w:t xml:space="preserve">§1, §6, §10; przypadki 1, 2 i 7 (§13)</w:t>
+              <w:t xml:space="preserve">pkt 1, pkt 6, pkt 10; przypadki 1, 2 i 7 (pkt 13)</w:t>
             </w:r>
           </w:p>
         </w:tc>
@@ -833,7 +833,7 @@
                 <w:sz w:val="17"/>
                 <w:szCs w:val="17"/>
               </w:rPr>
-              <w:t xml:space="preserve">§2, §3, §14 („ocenić skalę aktywności… strukturę… wartości istotne operacyjnie i sprzedażowo”)</w:t>
+              <w:t xml:space="preserve">pkt 2, pkt 3, pkt 14 ("ocenić skalę aktywności... strukturę... wartości istotne operacyjnie i sprzedażowo")</w:t>
             </w:r>
           </w:p>
         </w:tc>
@@ -1104,7 +1104,7 @@
                 <w:sz w:val="17"/>
                 <w:szCs w:val="17"/>
               </w:rPr>
-              <w:t xml:space="preserve">Pracownik wybiera „5. Raport zamówień”.</w:t>
+              <w:t xml:space="preserve">Pracownik wybiera "5. Raport zamówień".</w:t>
             </w:r>
           </w:p>
         </w:tc>
@@ -1520,7 +1520,7 @@
                 <w:sz w:val="17"/>
                 <w:szCs w:val="17"/>
               </w:rPr>
-              <w:t xml:space="preserve">Pracownik otrzymuje czytelny wynik z jawnym okresem albo informację „brak zamówień”; dane nie są zmieniane.</w:t>
+              <w:t xml:space="preserve">Pracownik otrzymuje czytelny wynik z jawnym okresem albo informację "brak zamówień"; dane nie są zmieniane.</w:t>
             </w:r>
           </w:p>
         </w:tc>
@@ -1820,7 +1820,7 @@
                 <w:sz w:val="17"/>
                 <w:szCs w:val="17"/>
               </w:rPr>
-              <w:t xml:space="preserve">BR §5; pole created_at w orders.json</w:t>
+              <w:t xml:space="preserve">BR pkt 5; pole created_at w orders.json</w:t>
             </w:r>
           </w:p>
         </w:tc>
@@ -1949,7 +1949,7 @@
                 <w:sz w:val="17"/>
                 <w:szCs w:val="17"/>
               </w:rPr>
-              <w:t xml:space="preserve">BR §5, §9, przypadek 6</w:t>
+              <w:t xml:space="preserve">BR pkt 5, pkt 9, przypadek 6</w:t>
             </w:r>
           </w:p>
         </w:tc>
@@ -2074,7 +2074,7 @@
                 <w:sz w:val="17"/>
                 <w:szCs w:val="17"/>
               </w:rPr>
-              <w:t xml:space="preserve">BR §5, §11; kod: build_order_report() sumuje pole total</w:t>
+              <w:t xml:space="preserve">BR pkt 5, pkt 11; kod: build_order_report() sumuje pole total</w:t>
             </w:r>
           </w:p>
         </w:tc>
@@ -2203,7 +2203,7 @@
                 <w:sz w:val="17"/>
                 <w:szCs w:val="17"/>
               </w:rPr>
-              <w:t xml:space="preserve">BR §3, §11</w:t>
+              <w:t xml:space="preserve">BR pkt 3, pkt 11</w:t>
             </w:r>
           </w:p>
         </w:tc>
@@ -2328,7 +2328,7 @@
                 <w:sz w:val="17"/>
                 <w:szCs w:val="17"/>
               </w:rPr>
-              <w:t xml:space="preserve">BR §9, przypadek 3</w:t>
+              <w:t xml:space="preserve">BR pkt 9, przypadek 3</w:t>
             </w:r>
           </w:p>
         </w:tc>
@@ -2457,7 +2457,7 @@
                 <w:sz w:val="17"/>
                 <w:szCs w:val="17"/>
               </w:rPr>
-              <w:t xml:space="preserve">BR §7, przypadek 4</w:t>
+              <w:t xml:space="preserve">BR pkt 7, przypadek 4</w:t>
             </w:r>
           </w:p>
         </w:tc>
@@ -2582,7 +2582,7 @@
                 <w:sz w:val="17"/>
                 <w:szCs w:val="17"/>
               </w:rPr>
-              <w:t xml:space="preserve">Przypadek 5 tylko sugeruje („zwykłe rozumienie”); zmienia, które zamówienia wejdą do raportu → pytanie 2</w:t>
+              <w:t xml:space="preserve">Przypadek 5 tylko sugeruje ("zwykłe rozumienie"); zmienia, które zamówienia wejdą do raportu -&gt; pytanie 2</w:t>
             </w:r>
           </w:p>
         </w:tc>
@@ -2711,7 +2711,7 @@
                 <w:sz w:val="17"/>
                 <w:szCs w:val="17"/>
               </w:rPr>
-              <w:t xml:space="preserve">System nie ma historii statusów; przypadek 7 może oczekiwać innej interpretacji → pytanie 4</w:t>
+              <w:t xml:space="preserve">System nie ma historii statusów; przypadek 7 może oczekiwać innej interpretacji -&gt; pytanie 4</w:t>
             </w:r>
           </w:p>
         </w:tc>
@@ -2836,7 +2836,7 @@
                 <w:sz w:val="17"/>
                 <w:szCs w:val="17"/>
               </w:rPr>
-              <w:t xml:space="preserve">BR nie określa formatu; wpływa na walidację i komunikaty błędów → pytanie 6</w:t>
+              <w:t xml:space="preserve">BR nie określa formatu; wpływa na walidację i komunikaty błędów -&gt; pytanie 6</w:t>
             </w:r>
           </w:p>
         </w:tc>
@@ -2965,7 +2965,7 @@
                 <w:sz w:val="17"/>
                 <w:szCs w:val="17"/>
               </w:rPr>
-              <w:t xml:space="preserve">Zmienia sposób liczenia najważniejszej liczby raportu → pytanie 1</w:t>
+              <w:t xml:space="preserve">Zmienia sposób liczenia najważniejszej liczby raportu -&gt; pytanie 1</w:t>
             </w:r>
           </w:p>
         </w:tc>
@@ -3498,7 +3498,7 @@
                 <w:sz w:val="17"/>
                 <w:szCs w:val="17"/>
               </w:rPr>
-              <w:t xml:space="preserve">Które statusy tworzą „wartość sprzedaży”? Czy liczymy też NEW (np. nieopłacone, pobranie przy odbiorze)?</w:t>
+              <w:t xml:space="preserve">Które statusy tworzą "wartość sprzedaży"? Czy liczymy też NEW (np. nieopłacone, pobranie przy odbiorze)?</w:t>
             </w:r>
           </w:p>
         </w:tc>
@@ -3656,7 +3656,7 @@
                 <w:sz w:val="17"/>
                 <w:szCs w:val="17"/>
               </w:rPr>
-              <w:t xml:space="preserve">Zakres zmiany - historia statusów oznaczałaby przebudowę modelu danych (poza zakresem wg §15)</w:t>
+              <w:t xml:space="preserve">Zakres zmiany - historia statusów oznaczałaby przebudowę modelu danych (poza zakresem wg pkt 15)</w:t>
             </w:r>
           </w:p>
         </w:tc>
@@ -3782,7 +3782,7 @@
                 <w:sz w:val="17"/>
                 <w:szCs w:val="17"/>
               </w:rPr>
-              <w:t xml:space="preserve">Zachowanie przy danych niespójnych (§11) i treść komunikatu</w:t>
+              <w:t xml:space="preserve">Zachowanie przy danych niespójnych (pkt 11) i treść komunikatu</w:t>
             </w:r>
           </w:p>
         </w:tc>
@@ -4036,7 +4036,7 @@
                 <w:sz w:val="17"/>
                 <w:szCs w:val="17"/>
               </w:rPr>
-              <w:t xml:space="preserve">Reguły walidacji - granica między ochroną przed błędem a blokowaniem analiz historycznych (§6)</w:t>
+              <w:t xml:space="preserve">Reguły walidacji - granica między ochroną przed błędem a blokowaniem analiz historycznych (pkt 6)</w:t>
             </w:r>
           </w:p>
         </w:tc>
@@ -4290,7 +4290,7 @@
                 <w:sz w:val="17"/>
                 <w:szCs w:val="17"/>
               </w:rPr>
-              <w:t xml:space="preserve">Prezentacja i weryfikowalność wyniku (§8, §10) bez kopiowania listy zamówień (§5)</w:t>
+              <w:t xml:space="preserve">Prezentacja i weryfikowalność wyniku (pkt 8, pkt 10) bez kopiowania listy zamówień (pkt 5)</w:t>
             </w:r>
           </w:p>
         </w:tc>
@@ -4418,7 +4418,7 @@
                 <w:sz w:val="17"/>
                 <w:szCs w:val="17"/>
               </w:rPr>
-              <w:t xml:space="preserve">Wpływ na istniejącą funkcję (§12) i układ menu</w:t>
+              <w:t xml:space="preserve">Wpływ na istniejącą funkcję (pkt 12) i układ menu</w:t>
             </w:r>
           </w:p>
         </w:tc>
@@ -4877,7 +4877,7 @@
                 <w:sz w:val="17"/>
                 <w:szCs w:val="17"/>
               </w:rPr>
-              <w:t xml:space="preserve">Definiuje „wartość sprzedaży”; odbiorcy raportu rozumieją ją różnie (§7).</w:t>
+              <w:t xml:space="preserve">Definiuje "wartość sprzedaży"; odbiorcy raportu rozumieją ją różnie (pkt 7).</w:t>
             </w:r>
           </w:p>
         </w:tc>
@@ -5070,7 +5070,7 @@
                 <w:sz w:val="17"/>
                 <w:szCs w:val="17"/>
               </w:rPr>
-              <w:t xml:space="preserve">Bez reguł zakresu nie da się jednoznacznie opisać, kiedy raport zostaje odrzucony (§6, przypadek 6).</w:t>
+              <w:t xml:space="preserve">Bez reguł zakresu nie da się jednoznacznie opisać, kiedy raport zostaje odrzucony (pkt 6, przypadek 6).</w:t>
             </w:r>
           </w:p>
         </w:tc>
@@ -5217,7 +5217,7 @@
           <w:sz w:val="20"/>
           <w:szCs w:val="20"/>
         </w:rPr>
-        <w:t xml:space="preserve">Pytanie 4 (status bieżący czy z końca okresu): jeśli PO oczekuje statusów historycznych, trzeba by przechowywać historię zmian statusów, czyli przebudować model danych - coś, co BR w §15 wyłącza z zakresu.</w:t>
+        <w:t xml:space="preserve">Pytanie 4 (status bieżący czy z końca okresu): jeśli PO oczekuje statusów historycznych, trzeba by przechowywać historię zmian statusów, czyli przebudować model danych - coś, co BR w pkt 15 wyłącza z zakresu.</w:t>
       </w:r>
     </w:p>
     <w:p>
@@ -5243,7 +5243,7 @@
           <w:sz w:val="20"/>
           <w:szCs w:val="20"/>
         </w:rPr>
-        <w:t xml:space="preserve">Że data końcowa jest włącznie do końca dnia - brzmi oczywiście, ale BR mówi tylko o „zwykłym rozumieniu zakresu dat”, a created_at zawiera godzinę, więc to wymaga potwierdzenia.</w:t>
+        <w:t xml:space="preserve">Że data końcowa jest włącznie do końca dnia - brzmi oczywiście, ale BR mówi tylko o "zwykłym rozumieniu zakresu dat", a created_at zawiera godzinę, więc to wymaga potwierdzenia.</w:t>
       </w:r>
     </w:p>
     <w:p>

</xml_diff>

<commit_message>
Ujednolicenie dokumentacji z pakietami: forma pierwszej osoby, bez exit ticketów 2 i 3
Pliki .md odpowiadają treści pakietów .docx po ręcznych poprawkach autora.

Co-Authored-By: Claude Opus 5.5 <noreply@anthropic.com>
Claude-Session: https://claude.ai/code/session_013ZAHXaNmfgzQq3snLwVkTj
</commit_message>
<xml_diff>
--- a/docs/pakiety/Pakiet_STUDENT_Lekcja_2_Szymankiewicz_34562.docx
+++ b/docs/pakiety/Pakiet_STUDENT_Lekcja_2_Szymankiewicz_34562.docx
@@ -20,7 +20,6 @@
       <w:pPr>
         <w:spacing w:after="240"/>
       </w:pPr>
-      <w:proofErr w:type="spellStart"/>
       <w:r>
         <w:rPr>
           <w:color w:val="4A5D7E"/>
@@ -29,7 +28,6 @@
         </w:rPr>
         <w:t>Business_Request_Rozszerzone_raportowanie_zamowien</w:t>
       </w:r>
-      <w:proofErr w:type="spellEnd"/>
     </w:p>
     <w:p>
       <w:pPr>
@@ -64,69 +62,12 @@
           <w:lang w:val="en-US"/>
         </w:rPr>
       </w:pPr>
-      <w:proofErr w:type="spellStart"/>
       <w:r>
         <w:rPr>
           <w:color w:val="595959"/>
           <w:lang w:val="en-US"/>
         </w:rPr>
-        <w:t>Repozytorium</w:t>
-      </w:r>
-      <w:proofErr w:type="spellEnd"/>
-      <w:r>
-        <w:rPr>
-          <w:color w:val="595959"/>
-          <w:lang w:val="en-US"/>
-        </w:rPr>
-        <w:t>: github.com/</w:t>
-      </w:r>
-      <w:proofErr w:type="spellStart"/>
-      <w:r>
-        <w:rPr>
-          <w:color w:val="595959"/>
-          <w:lang w:val="en-US"/>
-        </w:rPr>
-        <w:t>cewa</w:t>
-      </w:r>
-      <w:proofErr w:type="spellEnd"/>
-      <w:r>
-        <w:rPr>
-          <w:color w:val="595959"/>
-          <w:lang w:val="en-US"/>
-        </w:rPr>
-        <w:t>-stack/</w:t>
-      </w:r>
-      <w:proofErr w:type="spellStart"/>
-      <w:r>
-        <w:rPr>
-          <w:color w:val="595959"/>
-          <w:lang w:val="en-US"/>
-        </w:rPr>
-        <w:t>orderflow</w:t>
-      </w:r>
-      <w:proofErr w:type="spellEnd"/>
-      <w:r>
-        <w:rPr>
-          <w:color w:val="595959"/>
-          <w:lang w:val="en-US"/>
-        </w:rPr>
-        <w:t xml:space="preserve">, </w:t>
-      </w:r>
-      <w:proofErr w:type="spellStart"/>
-      <w:r>
-        <w:rPr>
-          <w:color w:val="595959"/>
-          <w:lang w:val="en-US"/>
-        </w:rPr>
-        <w:t>gałąź</w:t>
-      </w:r>
-      <w:proofErr w:type="spellEnd"/>
-      <w:r>
-        <w:rPr>
-          <w:color w:val="595959"/>
-          <w:lang w:val="en-US"/>
-        </w:rPr>
-        <w:t xml:space="preserve"> feature/order-reporting</w:t>
+        <w:t xml:space="preserve">Repozytorium: github.com/cewa-stack/orderflow, gałąź feature/order-reporting</w:t>
       </w:r>
     </w:p>
     <w:p>
@@ -167,55 +108,7 @@
           <w:sz w:val="18"/>
           <w:szCs w:val="18"/>
         </w:rPr>
-        <w:t xml:space="preserve">Pracujcie na pełnym Business </w:t>
-      </w:r>
-      <w:proofErr w:type="spellStart"/>
-      <w:r>
-        <w:rPr>
-          <w:sz w:val="18"/>
-          <w:szCs w:val="18"/>
-        </w:rPr>
-        <w:t>Requeście</w:t>
-      </w:r>
-      <w:proofErr w:type="spellEnd"/>
-      <w:r>
-        <w:rPr>
-          <w:sz w:val="18"/>
-          <w:szCs w:val="18"/>
-        </w:rPr>
-        <w:t xml:space="preserve">. Nie twórzcie jeszcze User Story, </w:t>
-      </w:r>
-      <w:proofErr w:type="spellStart"/>
-      <w:r>
-        <w:rPr>
-          <w:sz w:val="18"/>
-          <w:szCs w:val="18"/>
-        </w:rPr>
-        <w:t>Acceptance</w:t>
-      </w:r>
-      <w:proofErr w:type="spellEnd"/>
-      <w:r>
-        <w:rPr>
-          <w:sz w:val="18"/>
-          <w:szCs w:val="18"/>
-        </w:rPr>
-        <w:t xml:space="preserve"> </w:t>
-      </w:r>
-      <w:proofErr w:type="spellStart"/>
-      <w:r>
-        <w:rPr>
-          <w:sz w:val="18"/>
-          <w:szCs w:val="18"/>
-        </w:rPr>
-        <w:t>Criteria</w:t>
-      </w:r>
-      <w:proofErr w:type="spellEnd"/>
-      <w:r>
-        <w:rPr>
-          <w:sz w:val="18"/>
-          <w:szCs w:val="18"/>
-        </w:rPr>
-        <w:t xml:space="preserve"> ani projektu rozwiązania.</w:t>
+        <w:t xml:space="preserve">Pracujcie na pełnym Business Requeście. Nie twórzcie jeszcze User Story, Acceptance Criteria ani projektu rozwiązania.</w:t>
       </w:r>
     </w:p>
     <w:tbl>
@@ -420,30 +313,12 @@
             </w:tcMar>
           </w:tcPr>
           <w:p>
-            <w:proofErr w:type="spellStart"/>
-            <w:proofErr w:type="gramStart"/>
-            <w:r>
-              <w:rPr>
-                <w:sz w:val="17"/>
-                <w:szCs w:val="17"/>
-              </w:rPr>
-              <w:t>Moderator:Analityk</w:t>
-            </w:r>
-            <w:proofErr w:type="gramEnd"/>
-            <w:r>
-              <w:rPr>
-                <w:sz w:val="17"/>
-                <w:szCs w:val="17"/>
-              </w:rPr>
-              <w:t>:Sekretarz</w:t>
-            </w:r>
-            <w:proofErr w:type="spellEnd"/>
-            <w:r>
-              <w:rPr>
-                <w:sz w:val="17"/>
-                <w:szCs w:val="17"/>
-              </w:rPr>
-              <w:t>: Łukasz Szymankiewicz</w:t>
+            <w:r>
+              <w:rPr>
+                <w:sz w:val="17"/>
+                <w:szCs w:val="17"/>
+              </w:rPr>
+              <w:t>Moderator, Analityk, Sekretarz: Łukasz Szymankiewicz</w:t>
             </w:r>
           </w:p>
         </w:tc>
@@ -483,15 +358,7 @@
         <w:spacing w:after="120"/>
       </w:pPr>
       <w:r>
-        <w:t xml:space="preserve">Kierownik operacyjny nie może uzyskać w </w:t>
-      </w:r>
-      <w:proofErr w:type="spellStart"/>
-      <w:r>
-        <w:t>OrderFlow</w:t>
-      </w:r>
-      <w:proofErr w:type="spellEnd"/>
-      <w:r>
-        <w:t xml:space="preserve"> podsumowania zamówień dla wybranego okresu, bo obecny raport obejmuje całą historię, więc dane okresowe zbiera i sumuje ręcznie poza systemem. Wydłuża to przygotowanie podsumowań i grozi pominięciem zamówień lub błędnym zsumowaniem wartości.</w:t>
+        <w:t xml:space="preserve">Kierownik operacyjny nie może uzyskać w OrderFlow podsumowania zamówień dla wybranego okresu, bo obecny raport obejmuje całą historię, więc dane okresowe zbiera i sumuje ręcznie poza systemem. Wydłuża to przygotowanie podsumowań i grozi pominięciem zamówień lub błędnym zsumowaniem wartości.</w:t>
       </w:r>
     </w:p>
     <w:p>
@@ -513,15 +380,7 @@
         <w:spacing w:after="120"/>
       </w:pPr>
       <w:r>
-        <w:t xml:space="preserve">Pracownik wskazuje w </w:t>
-      </w:r>
-      <w:proofErr w:type="spellStart"/>
-      <w:r>
-        <w:t>OrderFlow</w:t>
-      </w:r>
-      <w:proofErr w:type="spellEnd"/>
-      <w:r>
-        <w:t xml:space="preserve"> początek i koniec okresu i dostaje czytelne podsumowanie (liczba, wartość, podział na statusy) albo jasną informację, dlaczego raportu nie da się przygotować. Wynik jest powtarzalny, nie zmienia danych i pozwala zaufać temu, które zamówienia zostały policzone.</w:t>
+        <w:t xml:space="preserve">Pracownik wskazuje w OrderFlow początek i koniec okresu i dostaje czytelne podsumowanie (liczba, wartość, podział na statusy) albo jasną informację, dlaczego raportu nie da się przygotować. Wynik jest powtarzalny, nie zmienia danych i pozwala zaufać temu, które zamówienia zostały policzone.</w:t>
       </w:r>
     </w:p>
     <w:p>
@@ -962,7 +821,7 @@
           <w:sz w:val="18"/>
           <w:szCs w:val="18"/>
         </w:rPr>
-        <w:t>[x] Nie opisaliśmy jeszcze konkretnego ekranu ani rozwiązania technicznego</w:t>
+        <w:t>[x] Nie opisałem jeszcze konkretnego ekranu ani rozwiązania technicznego</w:t>
       </w:r>
     </w:p>
     <w:p>
@@ -979,33 +838,8 @@
           <w:sz w:val="18"/>
           <w:szCs w:val="18"/>
         </w:rPr>
-        <w:t xml:space="preserve">[x] Każdy kluczowy fakt ma źródło w Business </w:t>
+        <w:t xml:space="preserve">[x] Każdy kluczowy fakt ma źródło w Business Requeście lub analizie OrderFlow</w:t>
       </w:r>
-      <w:proofErr w:type="spellStart"/>
-      <w:r>
-        <w:rPr>
-          <w:sz w:val="18"/>
-          <w:szCs w:val="18"/>
-        </w:rPr>
-        <w:t>Requeście</w:t>
-      </w:r>
-      <w:proofErr w:type="spellEnd"/>
-      <w:r>
-        <w:rPr>
-          <w:sz w:val="18"/>
-          <w:szCs w:val="18"/>
-        </w:rPr>
-        <w:t xml:space="preserve"> lub analizie </w:t>
-      </w:r>
-      <w:proofErr w:type="spellStart"/>
-      <w:r>
-        <w:rPr>
-          <w:sz w:val="18"/>
-          <w:szCs w:val="18"/>
-        </w:rPr>
-        <w:t>OrderFlow</w:t>
-      </w:r>
-      <w:proofErr w:type="spellEnd"/>
     </w:p>
     <w:p>
       <w:pPr>
@@ -1021,7 +855,7 @@
           <w:sz w:val="18"/>
           <w:szCs w:val="18"/>
         </w:rPr>
-        <w:t>[x] Potrafimy wyjaśnić różnicę między problemem a proponowaną funkcją</w:t>
+        <w:t>[x] Potrafię wyjaśnić różnicę między problemem a proponowaną funkcją</w:t>
       </w:r>
     </w:p>
     <w:p>
@@ -1492,23 +1326,7 @@
                 <w:sz w:val="17"/>
                 <w:szCs w:val="17"/>
               </w:rPr>
-              <w:t xml:space="preserve">Ręcznie sumuje liczbę i wartości poza </w:t>
-            </w:r>
-            <w:proofErr w:type="spellStart"/>
-            <w:r>
-              <w:rPr>
-                <w:sz w:val="17"/>
-                <w:szCs w:val="17"/>
-              </w:rPr>
-              <w:t>OrderFlow</w:t>
-            </w:r>
-            <w:proofErr w:type="spellEnd"/>
-            <w:r>
-              <w:rPr>
-                <w:sz w:val="17"/>
-                <w:szCs w:val="17"/>
-              </w:rPr>
-              <w:t>.</w:t>
+              <w:t xml:space="preserve">Ręcznie sumuje liczbę i wartości poza OrderFlow.</w:t>
             </w:r>
           </w:p>
         </w:tc>
@@ -1915,38 +1733,8 @@
                 <w:szCs w:val="17"/>
                 <w:lang w:val="en-US"/>
               </w:rPr>
-              <w:t xml:space="preserve">BR pkt 5; pole </w:t>
-            </w:r>
-            <w:proofErr w:type="spellStart"/>
-            <w:r>
-              <w:rPr>
-                <w:sz w:val="17"/>
-                <w:szCs w:val="17"/>
-                <w:lang w:val="en-US"/>
-              </w:rPr>
-              <w:t>created_at</w:t>
-            </w:r>
-            <w:proofErr w:type="spellEnd"/>
-            <w:r>
-              <w:rPr>
-                <w:sz w:val="17"/>
-                <w:szCs w:val="17"/>
-                <w:lang w:val="en-US"/>
-              </w:rPr>
-              <w:t xml:space="preserve"> w </w:t>
-            </w:r>
-            <w:proofErr w:type="spellStart"/>
-            <w:proofErr w:type="gramStart"/>
-            <w:r>
-              <w:rPr>
-                <w:sz w:val="17"/>
-                <w:szCs w:val="17"/>
-                <w:lang w:val="en-US"/>
-              </w:rPr>
-              <w:t>orders.json</w:t>
-            </w:r>
-            <w:proofErr w:type="spellEnd"/>
-            <w:proofErr w:type="gramEnd"/>
+              <w:t xml:space="preserve">BR pkt 5; pole created_at w orders.json</w:t>
+            </w:r>
           </w:p>
         </w:tc>
       </w:tr>
@@ -2186,79 +1974,7 @@
                 <w:szCs w:val="17"/>
                 <w:lang w:val="en-US"/>
               </w:rPr>
-              <w:t xml:space="preserve">BR pkt 5, pkt 11; </w:t>
-            </w:r>
-            <w:proofErr w:type="spellStart"/>
-            <w:r>
-              <w:rPr>
-                <w:sz w:val="17"/>
-                <w:szCs w:val="17"/>
-                <w:lang w:val="en-US"/>
-              </w:rPr>
-              <w:t>kod</w:t>
-            </w:r>
-            <w:proofErr w:type="spellEnd"/>
-            <w:r>
-              <w:rPr>
-                <w:sz w:val="17"/>
-                <w:szCs w:val="17"/>
-                <w:lang w:val="en-US"/>
-              </w:rPr>
-              <w:t xml:space="preserve">: </w:t>
-            </w:r>
-            <w:proofErr w:type="spellStart"/>
-            <w:r>
-              <w:rPr>
-                <w:sz w:val="17"/>
-                <w:szCs w:val="17"/>
-                <w:lang w:val="en-US"/>
-              </w:rPr>
-              <w:t>build_order_</w:t>
-            </w:r>
-            <w:proofErr w:type="gramStart"/>
-            <w:r>
-              <w:rPr>
-                <w:sz w:val="17"/>
-                <w:szCs w:val="17"/>
-                <w:lang w:val="en-US"/>
-              </w:rPr>
-              <w:t>report</w:t>
-            </w:r>
-            <w:proofErr w:type="spellEnd"/>
-            <w:r>
-              <w:rPr>
-                <w:sz w:val="17"/>
-                <w:szCs w:val="17"/>
-                <w:lang w:val="en-US"/>
-              </w:rPr>
-              <w:t>(</w:t>
-            </w:r>
-            <w:proofErr w:type="gramEnd"/>
-            <w:r>
-              <w:rPr>
-                <w:sz w:val="17"/>
-                <w:szCs w:val="17"/>
-                <w:lang w:val="en-US"/>
-              </w:rPr>
-              <w:t xml:space="preserve">) </w:t>
-            </w:r>
-            <w:proofErr w:type="spellStart"/>
-            <w:r>
-              <w:rPr>
-                <w:sz w:val="17"/>
-                <w:szCs w:val="17"/>
-                <w:lang w:val="en-US"/>
-              </w:rPr>
-              <w:t>sumuje</w:t>
-            </w:r>
-            <w:proofErr w:type="spellEnd"/>
-            <w:r>
-              <w:rPr>
-                <w:sz w:val="17"/>
-                <w:szCs w:val="17"/>
-                <w:lang w:val="en-US"/>
-              </w:rPr>
-              <w:t xml:space="preserve"> pole total</w:t>
+              <w:t xml:space="preserve">BR pkt 5, pkt 11; kod: build_order_report() sumuje pole total</w:t>
             </w:r>
           </w:p>
         </w:tc>
@@ -3109,23 +2825,7 @@
           <w:sz w:val="18"/>
           <w:szCs w:val="18"/>
         </w:rPr>
-        <w:t xml:space="preserve">F oznacza fakt, Z oznacza założenie, a P oznacza pytanie. Każde założenie powinno zostać potwierdzone, odrzucone albo zamienione w pytanie na </w:t>
-      </w:r>
-      <w:proofErr w:type="spellStart"/>
-      <w:r>
-        <w:rPr>
-          <w:sz w:val="18"/>
-          <w:szCs w:val="18"/>
-        </w:rPr>
-        <w:t>refinement</w:t>
-      </w:r>
-      <w:proofErr w:type="spellEnd"/>
-      <w:r>
-        <w:rPr>
-          <w:sz w:val="18"/>
-          <w:szCs w:val="18"/>
-        </w:rPr>
-        <w:t>.</w:t>
+        <w:t xml:space="preserve">F oznacza fakt, Z oznacza założenie, a P oznacza pytanie. Każde założenie powinno zostać potwierdzone, odrzucone albo zamienione w pytanie na refinement.</w:t>
       </w:r>
     </w:p>
     <w:p>
@@ -3140,19 +2840,8 @@
           <w:sz w:val="26"/>
           <w:szCs w:val="26"/>
         </w:rPr>
-        <w:t xml:space="preserve">Pytania na </w:t>
+        <w:t xml:space="preserve">Pytania na refinement</w:t>
       </w:r>
-      <w:proofErr w:type="spellStart"/>
-      <w:r>
-        <w:rPr>
-          <w:b/>
-          <w:bCs/>
-          <w:sz w:val="26"/>
-          <w:szCs w:val="26"/>
-        </w:rPr>
-        <w:t>refinement</w:t>
-      </w:r>
-      <w:proofErr w:type="spellEnd"/>
     </w:p>
     <w:p>
       <w:pPr>
@@ -3255,20 +2944,8 @@
                 <w:sz w:val="16"/>
                 <w:szCs w:val="16"/>
               </w:rPr>
-              <w:t xml:space="preserve">Pytanie do Product </w:t>
-            </w:r>
-            <w:proofErr w:type="spellStart"/>
-            <w:r>
-              <w:rPr>
-                <w:b/>
-                <w:bCs/>
-                <w:color w:val="FFFFFF"/>
-                <w:sz w:val="16"/>
-                <w:szCs w:val="16"/>
-              </w:rPr>
-              <w:t>Ownera</w:t>
-            </w:r>
-            <w:proofErr w:type="spellEnd"/>
+              <w:t xml:space="preserve">Pytanie do Product Ownera</w:t>
+            </w:r>
           </w:p>
         </w:tc>
         <w:tc>
@@ -3390,7 +3067,7 @@
                 <w:sz w:val="17"/>
                 <w:szCs w:val="17"/>
               </w:rPr>
-              <w:t>Czy zamówienia CANCELLED wliczamy do łącznej wartości okresu, czy pokazujemy je osobno (liczba i wartość anulowanych)?</w:t>
+              <w:t>Czy zamówienia CANCELLED wliczać do łącznej wartości okresu, czy pokazywać je osobno (liczba i wartość anulowanych)?</w:t>
             </w:r>
           </w:p>
         </w:tc>
@@ -3624,7 +3301,7 @@
                 <w:sz w:val="17"/>
                 <w:szCs w:val="17"/>
               </w:rPr>
-              <w:t>Które statusy tworzą "wartość sprzedaży"? Czy liczymy też NEW (np. nieopłacone, pobranie przy odbiorze)?</w:t>
+              <w:t>Które statusy tworzą "wartość sprzedaży"? Czy liczyć też NEW (np. nieopłacone, pobranie przy odbiorze)?</w:t>
             </w:r>
           </w:p>
         </w:tc>
@@ -3741,7 +3418,7 @@
                 <w:sz w:val="17"/>
                 <w:szCs w:val="17"/>
               </w:rPr>
-              <w:t>Czy raport pokazuje status bieżący, czy z końca okresu? Czy akceptujemy, że ponowny raport za ten sam okres po zmianie statusów da inny podział?</w:t>
+              <w:t>Czy raport pokazuje status bieżący, czy z końca okresu? Czy akceptowalne jest, że ponowny raport za ten sam okres po zmianie statusów da inny podział?</w:t>
             </w:r>
           </w:p>
         </w:tc>
@@ -3975,7 +3652,7 @@
                 <w:sz w:val="17"/>
                 <w:szCs w:val="17"/>
               </w:rPr>
-              <w:t>W jakim formacie wpisujemy daty? Czy potrzebne są skróty: dziś, wczoraj, bieżący tydzień/miesiąc?</w:t>
+              <w:t>W jakim formacie wpisywać daty? Czy potrzebne są skróty: dziś, wczoraj, bieżący tydzień/miesiąc?</w:t>
             </w:r>
           </w:p>
         </w:tc>
@@ -5140,21 +4817,7 @@
           <w:sz w:val="18"/>
           <w:szCs w:val="18"/>
         </w:rPr>
-        <w:t>[x] Wybra</w:t>
-      </w:r>
-      <w:r>
-        <w:rPr>
-          <w:sz w:val="18"/>
-          <w:szCs w:val="18"/>
-        </w:rPr>
-        <w:t>łem</w:t>
-      </w:r>
-      <w:r>
-        <w:rPr>
-          <w:sz w:val="18"/>
-          <w:szCs w:val="18"/>
-        </w:rPr>
-        <w:t xml:space="preserve"> 5 pytań, które mogą zmienić zakres lub wynik</w:t>
+        <w:t xml:space="preserve">[x] Wybrałem 5 pytań, które mogą zmienić zakres lub wynik</w:t>
       </w:r>
     </w:p>
     <w:p>
@@ -5188,37 +4851,7 @@
           <w:sz w:val="18"/>
           <w:szCs w:val="18"/>
         </w:rPr>
-        <w:t>[x] Potrafi</w:t>
-      </w:r>
-      <w:r>
-        <w:rPr>
-          <w:sz w:val="18"/>
-          <w:szCs w:val="18"/>
-        </w:rPr>
-        <w:t>ę</w:t>
-      </w:r>
-      <w:r>
-        <w:rPr>
-          <w:sz w:val="18"/>
-          <w:szCs w:val="18"/>
-        </w:rPr>
-        <w:t xml:space="preserve"> rozpocząć </w:t>
-      </w:r>
-      <w:proofErr w:type="spellStart"/>
-      <w:r>
-        <w:rPr>
-          <w:sz w:val="18"/>
-          <w:szCs w:val="18"/>
-        </w:rPr>
-        <w:t>refinement</w:t>
-      </w:r>
-      <w:proofErr w:type="spellEnd"/>
-      <w:r>
-        <w:rPr>
-          <w:sz w:val="18"/>
-          <w:szCs w:val="18"/>
-        </w:rPr>
-        <w:t xml:space="preserve"> bez prezentowania gotowego rozwiązania</w:t>
+        <w:t xml:space="preserve">[x] Potrafię rozpocząć refinement bez prezentowania gotowego rozwiązania</w:t>
       </w:r>
     </w:p>
     <w:p>
@@ -5262,29 +4895,7 @@
           <w:szCs w:val="22"/>
           <w:lang w:val="en-US"/>
         </w:rPr>
-        <w:t xml:space="preserve">Exit ticket </w:t>
-      </w:r>
-      <w:proofErr w:type="spellStart"/>
-      <w:r>
-        <w:rPr>
-          <w:b/>
-          <w:bCs/>
-          <w:sz w:val="22"/>
-          <w:szCs w:val="22"/>
-          <w:lang w:val="en-US"/>
-        </w:rPr>
-        <w:t>numer</w:t>
-      </w:r>
-      <w:proofErr w:type="spellEnd"/>
-      <w:r>
-        <w:rPr>
-          <w:b/>
-          <w:bCs/>
-          <w:sz w:val="22"/>
-          <w:szCs w:val="22"/>
-          <w:lang w:val="en-US"/>
-        </w:rPr>
-        <w:t xml:space="preserve"> 1</w:t>
+        <w:t xml:space="preserve">Exit ticket numer 1</w:t>
       </w:r>
     </w:p>
     <w:p>
@@ -5328,15 +4939,7 @@
         <w:spacing w:after="140"/>
       </w:pPr>
       <w:r>
-        <w:t xml:space="preserve">Że data końcowa jest włącznie do końca dnia - brzmi oczywiście, ale BR mówi tylko o "zwykłym rozumieniu zakresu dat", a </w:t>
-      </w:r>
-      <w:proofErr w:type="spellStart"/>
-      <w:r>
-        <w:t>created_at</w:t>
-      </w:r>
-      <w:proofErr w:type="spellEnd"/>
-      <w:r>
-        <w:t xml:space="preserve"> zawiera godzinę, więc to wymaga potwierdzenia.</w:t>
+        <w:t xml:space="preserve">Że data końcowa jest włącznie do końca dnia - brzmi oczywiście, ale BR mówi tylko o "zwykłym rozumieniu zakresu dat", a created_at zawiera godzinę, więc to wymaga potwierdzenia.</w:t>
       </w:r>
     </w:p>
     <w:p>

</xml_diff>